<commit_message>
Fill student details and contributions for PS2
Updated PS2_Group129.ipynb to replace placeholder student table and contribution rows with actual names, BITS IDs, emails, and specific contribution entries for Group 129. Also updated PS2_Group129_Report.docx (binary changed). Finalizes group metadata and contribution attribution for Assignment 1.
</commit_message>
<xml_diff>
--- a/2026-2027-Sem1/AIMLCZG521-ConversationalAI/ass-1/PS2_Group129_Report.docx
+++ b/2026-2027-Sem1/AIMLCZG521-ConversationalAI/ass-1/PS2_Group129_Report.docx
@@ -82,14 +82,6 @@
       </w:pPr>
       <w:r>
         <w:t xml:space="preserve">Student Details</w:t>
-      </w:r>
-    </w:p>
-    <w:p>
-      <w:pPr>
-        <w:spacing w:after="120"/>
-      </w:pPr>
-      <w:r>
-        <w:t xml:space="preserve">Replace the placeholders below with the group's actual details before submission.</w:t>
       </w:r>
     </w:p>
     <w:tbl>
@@ -175,7 +167,7 @@
                 <w:sz w:val="20"/>
                 <w:szCs w:val="20"/>
               </w:rPr>
-              <w:t xml:space="preserve">Member 1 — enter name</w:t>
+              <w:t xml:space="preserve">Pushadapu Sanjay Kumar</w:t>
             </w:r>
           </w:p>
         </w:tc>
@@ -191,7 +183,7 @@
                 <w:sz w:val="20"/>
                 <w:szCs w:val="20"/>
               </w:rPr>
-              <w:t xml:space="preserve">Enter BITS ID</w:t>
+              <w:t xml:space="preserve">2025ae05898</w:t>
             </w:r>
           </w:p>
         </w:tc>
@@ -207,7 +199,7 @@
                 <w:sz w:val="20"/>
                 <w:szCs w:val="20"/>
               </w:rPr>
-              <w:t xml:space="preserve">Enter email</w:t>
+              <w:t xml:space="preserve">2025ae05898@wilp.bits-pilani.ac.in</w:t>
             </w:r>
           </w:p>
         </w:tc>
@@ -225,7 +217,7 @@
                 <w:sz w:val="20"/>
                 <w:szCs w:val="20"/>
               </w:rPr>
-              <w:t xml:space="preserve">Member 2 — enter name</w:t>
+              <w:t xml:space="preserve">B Devchandraaj</w:t>
             </w:r>
           </w:p>
         </w:tc>
@@ -241,7 +233,7 @@
                 <w:sz w:val="20"/>
                 <w:szCs w:val="20"/>
               </w:rPr>
-              <w:t xml:space="preserve">Enter BITS ID</w:t>
+              <w:t xml:space="preserve">2025ae05469</w:t>
             </w:r>
           </w:p>
         </w:tc>
@@ -257,7 +249,7 @@
                 <w:sz w:val="20"/>
                 <w:szCs w:val="20"/>
               </w:rPr>
-              <w:t xml:space="preserve">Enter email</w:t>
+              <w:t xml:space="preserve">2025ae05469@wilp.bits-pilani.ac.in</w:t>
             </w:r>
           </w:p>
         </w:tc>
@@ -275,7 +267,7 @@
                 <w:sz w:val="20"/>
                 <w:szCs w:val="20"/>
               </w:rPr>
-              <w:t xml:space="preserve">Member 3 — enter name</w:t>
+              <w:t xml:space="preserve">Gourob Nandi</w:t>
             </w:r>
           </w:p>
         </w:tc>
@@ -291,7 +283,7 @@
                 <w:sz w:val="20"/>
                 <w:szCs w:val="20"/>
               </w:rPr>
-              <w:t xml:space="preserve">Enter BITS ID</w:t>
+              <w:t xml:space="preserve">2025ae05503</w:t>
             </w:r>
           </w:p>
         </w:tc>
@@ -307,7 +299,7 @@
                 <w:sz w:val="20"/>
                 <w:szCs w:val="20"/>
               </w:rPr>
-              <w:t xml:space="preserve">Enter email</w:t>
+              <w:t xml:space="preserve">2025ae05503@wilp.bits-pilani.ac.in</w:t>
             </w:r>
           </w:p>
         </w:tc>
@@ -325,7 +317,7 @@
                 <w:sz w:val="20"/>
                 <w:szCs w:val="20"/>
               </w:rPr>
-              <w:t xml:space="preserve">Member 4 — enter name</w:t>
+              <w:t xml:space="preserve">Anirudh Anand</w:t>
             </w:r>
           </w:p>
         </w:tc>
@@ -341,7 +333,7 @@
                 <w:sz w:val="20"/>
                 <w:szCs w:val="20"/>
               </w:rPr>
-              <w:t xml:space="preserve">Enter BITS ID</w:t>
+              <w:t xml:space="preserve">2025ae05576</w:t>
             </w:r>
           </w:p>
         </w:tc>
@@ -357,7 +349,7 @@
                 <w:sz w:val="20"/>
                 <w:szCs w:val="20"/>
               </w:rPr>
-              <w:t xml:space="preserve">Enter email</w:t>
+              <w:t xml:space="preserve">2025ae05576@wilp.bits-pilani.ac.in</w:t>
             </w:r>
           </w:p>
         </w:tc>
@@ -370,14 +362,6 @@
       </w:pPr>
       <w:r>
         <w:t xml:space="preserve">Group Contributions</w:t>
-      </w:r>
-    </w:p>
-    <w:p>
-      <w:pPr>
-        <w:spacing w:after="120"/>
-      </w:pPr>
-      <w:r>
-        <w:t xml:space="preserve">Replace the member labels below with the actual names.</w:t>
       </w:r>
     </w:p>
     <w:tbl>
@@ -463,7 +447,7 @@
                 <w:sz w:val="20"/>
                 <w:szCs w:val="20"/>
               </w:rPr>
-              <w:t xml:space="preserve">Member 1</w:t>
+              <w:t xml:space="preserve">Pushadapu Sanjay Kumar</w:t>
             </w:r>
           </w:p>
         </w:tc>
@@ -513,7 +497,7 @@
                 <w:sz w:val="20"/>
                 <w:szCs w:val="20"/>
               </w:rPr>
-              <w:t xml:space="preserve">Member 2</w:t>
+              <w:t xml:space="preserve">B Devchandraaj</w:t>
             </w:r>
           </w:p>
         </w:tc>
@@ -563,7 +547,7 @@
                 <w:sz w:val="20"/>
                 <w:szCs w:val="20"/>
               </w:rPr>
-              <w:t xml:space="preserve">Member 3</w:t>
+              <w:t xml:space="preserve">Gourob Nandi</w:t>
             </w:r>
           </w:p>
         </w:tc>
@@ -613,7 +597,7 @@
                 <w:sz w:val="20"/>
                 <w:szCs w:val="20"/>
               </w:rPr>
-              <w:t xml:space="preserve">Member 4</w:t>
+              <w:t xml:space="preserve">Anirudh Anand</w:t>
             </w:r>
           </w:p>
         </w:tc>

</xml_diff>

<commit_message>
Correct contributor order and update reportu
Swap contributor rows in 2026-2027-Sem1/AIMLCZG521-ConversationalAI/ass-1/PS2_Group129.ipynb so Pushadapu Sanjay Kumar and B Devchandraaj reflect their correct contribution areas. Update the corresponding PS2_Group129_Report.docx to match. Change is limited to contributor metadata in the notebook and the report document.
</commit_message>
<xml_diff>
--- a/2026-2027-Sem1/AIMLCZG521-ConversationalAI/ass-1/PS2_Group129_Report.docx
+++ b/2026-2027-Sem1/AIMLCZG521-ConversationalAI/ass-1/PS2_Group129_Report.docx
@@ -447,57 +447,57 @@
                 <w:sz w:val="20"/>
                 <w:szCs w:val="20"/>
               </w:rPr>
+              <w:t xml:space="preserve">B Devchandraaj</w:t>
+            </w:r>
+          </w:p>
+        </w:tc>
+        <w:tc>
+          <w:tcPr>
+            <w:tcW w:type="dxa" w:w="2800"/>
+          </w:tcPr>
+          <w:p>
+            <w:r>
+              <w:rPr>
+                <w:b w:val="false"/>
+                <w:bCs w:val="false"/>
+                <w:sz w:val="20"/>
+                <w:szCs w:val="20"/>
+              </w:rPr>
+              <w:t xml:space="preserve">Dataset &amp; embedding</w:t>
+            </w:r>
+          </w:p>
+        </w:tc>
+        <w:tc>
+          <w:tcPr>
+            <w:tcW w:type="dxa" w:w="4360"/>
+          </w:tcPr>
+          <w:p>
+            <w:r>
+              <w:rPr>
+                <w:b w:val="false"/>
+                <w:bCs w:val="false"/>
+                <w:sz w:val="20"/>
+                <w:szCs w:val="20"/>
+              </w:rPr>
+              <w:t xml:space="preserve">Dataset loading, validation, and embedding generation</w:t>
+            </w:r>
+          </w:p>
+        </w:tc>
+      </w:tr>
+      <w:tr>
+        <w:tc>
+          <w:tcPr>
+            <w:tcW w:type="dxa" w:w="2200"/>
+          </w:tcPr>
+          <w:p>
+            <w:r>
+              <w:rPr>
+                <w:b w:val="false"/>
+                <w:bCs w:val="false"/>
+                <w:sz w:val="20"/>
+                <w:szCs w:val="20"/>
+              </w:rPr>
               <w:t xml:space="preserve">Pushadapu Sanjay Kumar</w:t>
-            </w:r>
-          </w:p>
-        </w:tc>
-        <w:tc>
-          <w:tcPr>
-            <w:tcW w:type="dxa" w:w="2800"/>
-          </w:tcPr>
-          <w:p>
-            <w:r>
-              <w:rPr>
-                <w:b w:val="false"/>
-                <w:bCs w:val="false"/>
-                <w:sz w:val="20"/>
-                <w:szCs w:val="20"/>
-              </w:rPr>
-              <w:t xml:space="preserve">Dataset &amp; embedding</w:t>
-            </w:r>
-          </w:p>
-        </w:tc>
-        <w:tc>
-          <w:tcPr>
-            <w:tcW w:type="dxa" w:w="4360"/>
-          </w:tcPr>
-          <w:p>
-            <w:r>
-              <w:rPr>
-                <w:b w:val="false"/>
-                <w:bCs w:val="false"/>
-                <w:sz w:val="20"/>
-                <w:szCs w:val="20"/>
-              </w:rPr>
-              <w:t xml:space="preserve">Dataset loading, validation, and embedding generation</w:t>
-            </w:r>
-          </w:p>
-        </w:tc>
-      </w:tr>
-      <w:tr>
-        <w:tc>
-          <w:tcPr>
-            <w:tcW w:type="dxa" w:w="2200"/>
-          </w:tcPr>
-          <w:p>
-            <w:r>
-              <w:rPr>
-                <w:b w:val="false"/>
-                <w:bCs w:val="false"/>
-                <w:sz w:val="20"/>
-                <w:szCs w:val="20"/>
-              </w:rPr>
-              <w:t xml:space="preserve">B Devchandraaj</w:t>
             </w:r>
           </w:p>
         </w:tc>

</xml_diff>

<commit_message>
Sync report DOCX with current notebook run; robust speedup wording
Update all stale figures in the Word report to match the current
executed notebook (main): HNSW efSearch=16 recall 0.777, refreshed
latency/speedup tables (HNSW/IVF), exact latency 0.347 ms, Task 7 mean
hits@5 0.600 and refreshed lexical means, and the two changed Task 7
example queries (Tetraspanin-3, Bcl2). Correct the highest-recall config
to efSearch=64. De-precision hardware-dependent speedups in the prose
(recall-anchored; per-run speedups delegated to Task 6) so the narrative
does not drift on re-runs.

Report PDF to be regenerated from this DOCX in the virtual lab.

Co-Authored-By: Claude Opus 4.8 <noreply@anthropic.com>
Claude-Session: https://claude.ai/code/session_01UrANaVfaxgtoHyNDputRvx
</commit_message>
<xml_diff>
--- a/2026-2027-Sem1/AIMLCZG521-ConversationalAI/ass-1/PS2_Group129_Report.docx
+++ b/2026-2027-Sem1/AIMLCZG521-ConversationalAI/ass-1/PS2_Group129_Report.docx
@@ -829,7 +829,7 @@
           </w:tcPr>
           <w:p>
             <w:r>
-              <w:t>HNSW efSearch=16 - Recall@5 0.770, 6.84x faster than exact</w:t>
+              <w:t>HNSW efSearch=16 - Recall@5 0.777; fastest eligible config clearing the 0.75 bar (per-run speedup in Task 6)</w:t>
             </w:r>
           </w:p>
         </w:tc>
@@ -851,7 +851,7 @@
           </w:tcPr>
           <w:p>
             <w:r>
-              <w:t>IVF nprobe=1 - 15.20x faster but Recall@5 only 0.502</w:t>
+              <w:t>IVF nprobe=1 - fastest overall but Recall@5 only 0.502 (below the quality bar)</w:t>
             </w:r>
           </w:p>
         </w:tc>
@@ -885,7 +885,7 @@
                 <w:sz w:val="20"/>
                 <w:szCs w:val="20"/>
               </w:rPr>
-              <w:t>Mean Top-5 set overlap 0.112 — the two models retrieve largely different documents</w:t>
+              <w:t>Mean Top-5 set overlap 0.135 — the two models retrieve largely different documents</w:t>
             </w:r>
           </w:p>
         </w:tc>
@@ -896,7 +896,7 @@
         <w:spacing w:after="120"/>
       </w:pPr>
       <w:r>
-        <w:t>Recommendation. Embed with BGE-large (unit-normalized) and serve HNSW efSearch=16; this is the fastest eligible configuration in the current executed run (Recall@5 0.770, 6.84x speedup). Where RAM is the binding constraint, use IVF nprobe=20 and verify the footprint on target hardware.</w:t>
+        <w:t>Recommendation. Embed with BGE-large (unit-normalized) and serve HNSW efSearch=16 — the fastest eligible configuration in the executed run (Recall@5 0.777), clearing the Recall@5 ≥ 0.75 quality bar; per-run speedup is reported in the notebook's Task 6 output. Where RAM is the binding constraint, use IVF nprobe=20 and verify the footprint on target hardware.</w:t>
       </w:r>
     </w:p>
     <w:p>
@@ -1747,7 +1747,7 @@
           </w:tcPr>
           <w:p>
             <w:r>
-              <w:t>0.228 ms (mean 0.231 ms)</w:t>
+              <w:t>0.347 ms (mean 0.619 ms)</w:t>
             </w:r>
           </w:p>
         </w:tc>
@@ -1961,27 +1961,27 @@
           </w:tcPr>
           <w:p>
             <w:r>
-              <w:t>0.770</w:t>
-            </w:r>
-          </w:p>
-        </w:tc>
-        <w:tc>
-          <w:tcPr>
-            <w:tcW w:type="dxa" w:w="2340"/>
-          </w:tcPr>
-          <w:p>
-            <w:r>
-              <w:t>0.032 ms</w:t>
-            </w:r>
-          </w:p>
-        </w:tc>
-        <w:tc>
-          <w:tcPr>
-            <w:tcW w:type="dxa" w:w="2340"/>
-          </w:tcPr>
-          <w:p>
-            <w:r>
-              <w:t>6.84x</w:t>
+              <w:t>0.777</w:t>
+            </w:r>
+          </w:p>
+        </w:tc>
+        <w:tc>
+          <w:tcPr>
+            <w:tcW w:type="dxa" w:w="2340"/>
+          </w:tcPr>
+          <w:p>
+            <w:r>
+              <w:t>0.042 ms</w:t>
+            </w:r>
+          </w:p>
+        </w:tc>
+        <w:tc>
+          <w:tcPr>
+            <w:tcW w:type="dxa" w:w="2340"/>
+          </w:tcPr>
+          <w:p>
+            <w:r>
+              <w:t>14.65x</w:t>
             </w:r>
           </w:p>
         </w:tc>
@@ -2003,6 +2003,48 @@
           </w:tcPr>
           <w:p>
             <w:r>
+              <w:t>0.777</w:t>
+            </w:r>
+          </w:p>
+        </w:tc>
+        <w:tc>
+          <w:tcPr>
+            <w:tcW w:type="dxa" w:w="2340"/>
+          </w:tcPr>
+          <w:p>
+            <w:r>
+              <w:t>0.071 ms</w:t>
+            </w:r>
+          </w:p>
+        </w:tc>
+        <w:tc>
+          <w:tcPr>
+            <w:tcW w:type="dxa" w:w="2340"/>
+          </w:tcPr>
+          <w:p>
+            <w:r>
+              <w:t>8.66x</w:t>
+            </w:r>
+          </w:p>
+        </w:tc>
+      </w:tr>
+      <w:tr>
+        <w:tc>
+          <w:tcPr>
+            <w:tcW w:type="dxa" w:w="2340"/>
+          </w:tcPr>
+          <w:p>
+            <w:r>
+              <w:t>64</w:t>
+            </w:r>
+          </w:p>
+        </w:tc>
+        <w:tc>
+          <w:tcPr>
+            <w:tcW w:type="dxa" w:w="2340"/>
+          </w:tcPr>
+          <w:p>
+            <w:r>
               <w:t>0.780</w:t>
             </w:r>
           </w:p>
@@ -2013,29 +2055,29 @@
           </w:tcPr>
           <w:p>
             <w:r>
-              <w:t>0.059 ms</w:t>
-            </w:r>
-          </w:p>
-        </w:tc>
-        <w:tc>
-          <w:tcPr>
-            <w:tcW w:type="dxa" w:w="2340"/>
-          </w:tcPr>
-          <w:p>
-            <w:r>
-              <w:t>3.72x</w:t>
-            </w:r>
-          </w:p>
-        </w:tc>
-      </w:tr>
-      <w:tr>
-        <w:tc>
-          <w:tcPr>
-            <w:tcW w:type="dxa" w:w="2340"/>
-          </w:tcPr>
-          <w:p>
-            <w:r>
-              <w:t>64</w:t>
+              <w:t>0.139 ms</w:t>
+            </w:r>
+          </w:p>
+        </w:tc>
+        <w:tc>
+          <w:tcPr>
+            <w:tcW w:type="dxa" w:w="2340"/>
+          </w:tcPr>
+          <w:p>
+            <w:r>
+              <w:t>4.44x</w:t>
+            </w:r>
+          </w:p>
+        </w:tc>
+      </w:tr>
+      <w:tr>
+        <w:tc>
+          <w:tcPr>
+            <w:tcW w:type="dxa" w:w="2340"/>
+          </w:tcPr>
+          <w:p>
+            <w:r>
+              <w:t>128</w:t>
             </w:r>
           </w:p>
         </w:tc>
@@ -2055,59 +2097,17 @@
           </w:tcPr>
           <w:p>
             <w:r>
-              <w:t>0.116 ms</w:t>
-            </w:r>
-          </w:p>
-        </w:tc>
-        <w:tc>
-          <w:tcPr>
-            <w:tcW w:type="dxa" w:w="2340"/>
-          </w:tcPr>
-          <w:p>
-            <w:r>
-              <w:t>1.88x</w:t>
-            </w:r>
-          </w:p>
-        </w:tc>
-      </w:tr>
-      <w:tr>
-        <w:tc>
-          <w:tcPr>
-            <w:tcW w:type="dxa" w:w="2340"/>
-          </w:tcPr>
-          <w:p>
-            <w:r>
-              <w:t>128</w:t>
-            </w:r>
-          </w:p>
-        </w:tc>
-        <w:tc>
-          <w:tcPr>
-            <w:tcW w:type="dxa" w:w="2340"/>
-          </w:tcPr>
-          <w:p>
-            <w:r>
-              <w:t>0.780</w:t>
-            </w:r>
-          </w:p>
-        </w:tc>
-        <w:tc>
-          <w:tcPr>
-            <w:tcW w:type="dxa" w:w="2340"/>
-          </w:tcPr>
-          <w:p>
-            <w:r>
-              <w:t>0.218 ms</w:t>
-            </w:r>
-          </w:p>
-        </w:tc>
-        <w:tc>
-          <w:tcPr>
-            <w:tcW w:type="dxa" w:w="2340"/>
-          </w:tcPr>
-          <w:p>
-            <w:r>
-              <w:t>1.00x</w:t>
+              <w:t>0.224 ms</w:t>
+            </w:r>
+          </w:p>
+        </w:tc>
+        <w:tc>
+          <w:tcPr>
+            <w:tcW w:type="dxa" w:w="2340"/>
+          </w:tcPr>
+          <w:p>
+            <w:r>
+              <w:t>2.76x</w:t>
             </w:r>
           </w:p>
         </w:tc>
@@ -2237,17 +2237,17 @@
           </w:tcPr>
           <w:p>
             <w:r>
-              <w:t>0.014 ms</w:t>
-            </w:r>
-          </w:p>
-        </w:tc>
-        <w:tc>
-          <w:tcPr>
-            <w:tcW w:type="dxa" w:w="2340"/>
-          </w:tcPr>
-          <w:p>
-            <w:r>
-              <w:t>15.20x</w:t>
+              <w:t>0.017 ms</w:t>
+            </w:r>
+          </w:p>
+        </w:tc>
+        <w:tc>
+          <w:tcPr>
+            <w:tcW w:type="dxa" w:w="2340"/>
+          </w:tcPr>
+          <w:p>
+            <w:r>
+              <w:t>35.77x</w:t>
             </w:r>
           </w:p>
         </w:tc>
@@ -2289,7 +2289,7 @@
           </w:tcPr>
           <w:p>
             <w:r>
-              <w:t>5.60x</w:t>
+              <w:t>15.91x</w:t>
             </w:r>
           </w:p>
         </w:tc>
@@ -2321,17 +2321,17 @@
           </w:tcPr>
           <w:p>
             <w:r>
-              <w:t>0.068 ms</w:t>
-            </w:r>
-          </w:p>
-        </w:tc>
-        <w:tc>
-          <w:tcPr>
-            <w:tcW w:type="dxa" w:w="2340"/>
-          </w:tcPr>
-          <w:p>
-            <w:r>
-              <w:t>3.21x</w:t>
+              <w:t>0.074 ms</w:t>
+            </w:r>
+          </w:p>
+        </w:tc>
+        <w:tc>
+          <w:tcPr>
+            <w:tcW w:type="dxa" w:w="2340"/>
+          </w:tcPr>
+          <w:p>
+            <w:r>
+              <w:t>8.36x</w:t>
             </w:r>
           </w:p>
         </w:tc>
@@ -2363,17 +2363,17 @@
           </w:tcPr>
           <w:p>
             <w:r>
-              <w:t>0.127 ms</w:t>
-            </w:r>
-          </w:p>
-        </w:tc>
-        <w:tc>
-          <w:tcPr>
-            <w:tcW w:type="dxa" w:w="2340"/>
-          </w:tcPr>
-          <w:p>
-            <w:r>
-              <w:t>1.73x</w:t>
+              <w:t>0.145 ms</w:t>
+            </w:r>
+          </w:p>
+        </w:tc>
+        <w:tc>
+          <w:tcPr>
+            <w:tcW w:type="dxa" w:w="2340"/>
+          </w:tcPr>
+          <w:p>
+            <w:r>
+              <w:t>4.26x</w:t>
             </w:r>
           </w:p>
         </w:tc>
@@ -2590,7 +2590,7 @@
           </w:tcPr>
           <w:p>
             <w:r>
-              <w:t>0.014 ms</w:t>
+              <w:t>0.017 ms</w:t>
             </w:r>
           </w:p>
         </w:tc>
@@ -2612,7 +2612,7 @@
           </w:tcPr>
           <w:p>
             <w:r>
-              <w:t>HNSW efSearch=32</w:t>
+              <w:t>HNSW efSearch=64</w:t>
             </w:r>
           </w:p>
         </w:tc>
@@ -2632,7 +2632,7 @@
           </w:tcPr>
           <w:p>
             <w:r>
-              <w:t>0.059 ms</w:t>
+              <w:t>0.139 ms</w:t>
             </w:r>
           </w:p>
         </w:tc>
@@ -2664,17 +2664,17 @@
           </w:tcPr>
           <w:p>
             <w:r>
-              <w:t>0.770</w:t>
-            </w:r>
-          </w:p>
-        </w:tc>
-        <w:tc>
-          <w:tcPr>
-            <w:tcW w:type="dxa" w:w="2340"/>
-          </w:tcPr>
-          <w:p>
-            <w:r>
-              <w:t>0.032 ms</w:t>
+              <w:t>0.777</w:t>
+            </w:r>
+          </w:p>
+        </w:tc>
+        <w:tc>
+          <w:tcPr>
+            <w:tcW w:type="dxa" w:w="2340"/>
+          </w:tcPr>
+          <w:p>
+            <w:r>
+              <w:t>0.042 ms</w:t>
             </w:r>
           </w:p>
         </w:tc>
@@ -2685,7 +2685,7 @@
         <w:spacing w:after="120"/>
       </w:pPr>
       <w:r>
-        <w:t>Recommendation for high query volume. Use HNSW efSearch=16, the fastest eligible configuration in the current executed run (Recall@5 0.770 and 6.84x speedup) that meets the Recall@5 &gt;= 0.75 quality bar. IVF nprobe=1 is fastest overall (15.20x) but its Recall@5 (0.502) falls well below the threshold and is rejected. HNSW efSearch=32 reaches the highest measured recall (0.780) at 0.059 ms, while IVF nprobe=20 reaches 0.769 at 0.127 ms and 1.73x speedup.</w:t>
+        <w:t>Recommendation for high query volume. Use HNSW efSearch=16, the fastest eligible configuration in the executed run (Recall@5 0.777) that meets the Recall@5 ≥ 0.75 quality bar. IVF nprobe=1 is fastest overall but its Recall@5 (0.502) falls well below the threshold and is rejected. HNSW efSearch=64 reaches the highest measured recall (0.780); IVF nprobe=20 reaches 0.769. Absolute latency and speedup are hardware-dependent and are reported per configuration in Tables 5–6 and the notebook's Task 6 output; recall is hardware-independent.</w:t>
       </w:r>
     </w:p>
     <w:p>
@@ -2813,7 +2813,7 @@
                 <w:sz w:val="20"/>
                 <w:szCs w:val="20"/>
               </w:rPr>
-              <w:t>0.239</w:t>
+              <w:t>0.280</w:t>
             </w:r>
           </w:p>
         </w:tc>
@@ -2829,7 +2829,7 @@
                 <w:sz w:val="20"/>
                 <w:szCs w:val="20"/>
               </w:rPr>
-              <w:t>0.337</w:t>
+              <w:t>0.386</w:t>
             </w:r>
           </w:p>
         </w:tc>
@@ -2879,7 +2879,7 @@
                 <w:sz w:val="20"/>
                 <w:szCs w:val="20"/>
               </w:rPr>
-              <w:t>0.700</w:t>
+              <w:t>0.600</w:t>
             </w:r>
           </w:p>
         </w:tc>
@@ -2890,7 +2890,7 @@
         <w:spacing w:after="120"/>
       </w:pPr>
       <w:r>
-        <w:t>Mean Top-5 set overlap (Jaccard) across all 10 queries: 0.112. First-result agreement: 0.100. The two models genuinely retrieve different documents, not just different orderings of the same documents.</w:t>
+        <w:t>Mean Top-5 set overlap (Jaccard) across all 10 queries: 0.135. First-result agreement: 0.100. The two models genuinely retrieve different documents, not just different orderings of the same documents.</w:t>
       </w:r>
     </w:p>
     <w:p>
@@ -2911,11 +2911,9 @@
           <w:b/>
           <w:bCs/>
         </w:rPr>
-        <w:t xml:space="preserve">1. Retrieved sets diverge. </w:t>
-      </w:r>
-      <w:r>
-        <w:t>Query “Cell autonomous sex determination in somatic cells does not occur in Galliformes” (12 words) — Top-5 sets share 0% overlap (Jaccard=0.00); BGE hits@5=1, DistilBERT hits@5=0. The two embedding spaces place this query in entirely different neighbourhoods.</w:t>
-      </w:r>
+        <w:t>1. Retrieved sets diverge. Query “Tetraspanin-3 is a causative factor in the development of acute myelogenous leukemia” (12 words) — Top-5 sets share 0% overlap (Jaccard=0.00); BGE hits@5=1, DistilBERT hits@5=0. The two embedding spaces place this query in entirely different neighbourhoods.</w:t>
+      </w:r>
+      <w:r/>
     </w:p>
     <w:p>
       <w:pPr>
@@ -2926,11 +2924,9 @@
           <w:b/>
           <w:bCs/>
         </w:rPr>
-        <w:t xml:space="preserve">2. Semantic/domain-terminology match (BGE advantage). </w:t>
-      </w:r>
-      <w:r>
-        <w:t>Query “Ly6C hi monocytes have a lower inflammatory capacity than Ly6C lo monocytes” (12 words) — BGE hits@5=2 vs. DistilBERT hits@5=1 at comparable lexical overlap (0.35 vs. 0.25). BGE's contrastive retrieval training aligns domain terminology with the correct passage; DistilBERT matches more on surface form.</w:t>
-      </w:r>
+        <w:t>2. Semantic/domain-terminology match (BGE advantage). Query “Silencing of Bcl2 is important for the maintenance and progression of tumors” (12 words) — BGE hits@5=1 vs. DistilBERT hits@5=0 at comparable lexical overlap (0.45 vs. 0.40). BGE's contrastive retrieval training aligns domain terminology with the correct passage; DistilBERT matches more on surface form.</w:t>
+      </w:r>
+      <w:r/>
     </w:p>
     <w:p>
       <w:pPr>
@@ -3087,7 +3083,7 @@
           </w:tcPr>
           <w:p>
             <w:r>
-              <w:t>HNSW efSearch=16 - Recall@5 0.770 at 6.84x speedup, fastest eligible configuration meeting the 0.75 bar</w:t>
+              <w:t>HNSW efSearch=16 - Recall@5 0.777, fastest eligible configuration clearing the 0.75 bar (per-run speedup reported in Task 6)</w:t>
             </w:r>
           </w:p>
         </w:tc>
@@ -3221,7 +3217,7 @@
         <w:spacing w:after="120"/>
       </w:pPr>
       <w:r>
-        <w:t>Embed with BAAI/bge-large-en-v1.5 (unit-normalized) and serve an HNSW index at efSearch=16, the fastest eligible configuration in the current executed run (Recall@5 0.770, 6.84x speedup). Where RAM is the binding constraint, use IVF nprobe=20 (Recall@5 0.769, 1.73x speedup), but verify the memory footprint on target hardware because it was not measured here.</w:t>
+        <w:t>Embed with BAAI/bge-large-en-v1.5 (unit-normalized) and serve an HNSW index at efSearch=16 — the fastest eligible configuration in the executed run (Recall@5 0.777), clearing the 0.75 bar. Where RAM is the binding constraint, use IVF nprobe=20 (Recall@5 0.769), but verify the memory footprint on target hardware because it was not measured here. Absolute latency and speedup are hardware-dependent (reported per run in Task 6); recall is not.</w:t>
       </w:r>
     </w:p>
     <w:p>

</xml_diff>

<commit_message>
Insert Virtual Lab screenshots into report as a captioned appendix
The 5 Virtual Lab (RunPod) screenshots were present in the DOCX media
store but orphaned (not placed in the document body), so they did not
display. Add an 'Appendix — Virtual Lab Execution Screenshots' section
that places all five with descriptive captions (notebook header, Task 2
timings, Task 3 DistilBERT/BGE checks, Task 8 cross-model comparison).
python-docx reused the existing image parts, so no media is duplicated.

Report PDF to be regenerated from this DOCX in the virtual lab.

Co-Authored-By: Claude Opus 4.8 <noreply@anthropic.com>
Claude-Session: https://claude.ai/code/session_01UrANaVfaxgtoHyNDputRvx
</commit_message>
<xml_diff>
--- a/2026-2027-Sem1/AIMLCZG521-ConversationalAI/ass-1/PS2_Group129_Report.docx
+++ b/2026-2027-Sem1/AIMLCZG521-ConversationalAI/ass-1/PS2_Group129_Report.docx
@@ -3374,6 +3374,293 @@
       </w:r>
       <w:r>
         <w:t xml:space="preserve"> https://arxiv.org/abs/1702.08734</w:t>
+      </w:r>
+    </w:p>
+    <w:p>
+      <w:r>
+        <w:br w:type="page"/>
+      </w:r>
+    </w:p>
+    <w:p>
+      <w:r>
+        <w:t>Appendix — Virtual Lab Execution Screenshots</w:t>
+      </w:r>
+    </w:p>
+    <w:p>
+      <w:r>
+        <w:rPr>
+          <w:b/>
+          <w:sz w:val="28"/>
+        </w:rPr>
+        <w:t>Appendix — Virtual Lab Execution Screenshots</w:t>
+      </w:r>
+    </w:p>
+    <w:p>
+      <w:r>
+        <w:rPr>
+          <w:i/>
+        </w:rPr>
+        <w:t>The following screenshots evidence end-to-end execution of the notebook in the RunPod Virtual Lab.</w:t>
+      </w:r>
+    </w:p>
+    <w:p>
+      <w:pPr>
+        <w:jc w:val="center"/>
+      </w:pPr>
+      <w:r>
+        <w:drawing>
+          <wp:inline xmlns:a="http://schemas.openxmlformats.org/drawingml/2006/main" xmlns:pic="http://schemas.openxmlformats.org/drawingml/2006/picture">
+            <wp:extent cx="5760720" cy="4468435"/>
+            <wp:docPr id="7" name="Picture 7"/>
+            <wp:cNvGraphicFramePr>
+              <a:graphicFrameLocks noChangeAspect="1"/>
+            </wp:cNvGraphicFramePr>
+            <a:graphic>
+              <a:graphicData uri="http://schemas.openxmlformats.org/drawingml/2006/picture">
+                <pic:pic>
+                  <pic:nvPicPr>
+                    <pic:cNvPr id="0" name="image.png"/>
+                    <pic:cNvPicPr/>
+                  </pic:nvPicPr>
+                  <pic:blipFill>
+                    <a:blip r:embed="rId9"/>
+                    <a:stretch>
+                      <a:fillRect/>
+                    </a:stretch>
+                  </pic:blipFill>
+                  <pic:spPr>
+                    <a:xfrm>
+                      <a:off x="0" y="0"/>
+                      <a:ext cx="5760720" cy="4468435"/>
+                    </a:xfrm>
+                    <a:prstGeom prst="rect"/>
+                  </pic:spPr>
+                </pic:pic>
+              </a:graphicData>
+            </a:graphic>
+          </wp:inline>
+        </w:drawing>
+      </w:r>
+    </w:p>
+    <w:p>
+      <w:pPr>
+        <w:jc w:val="center"/>
+      </w:pPr>
+      <w:r>
+        <w:rPr>
+          <w:i/>
+          <w:color w:val="555555"/>
+          <w:sz w:val="18"/>
+        </w:rPr>
+        <w:t>Figure A1 — Virtual Lab (RunPod JupyterLab): notebook header, Student Details, and Group Contributions.</w:t>
+      </w:r>
+    </w:p>
+    <w:p>
+      <w:pPr>
+        <w:jc w:val="center"/>
+      </w:pPr>
+      <w:r>
+        <w:drawing>
+          <wp:inline xmlns:a="http://schemas.openxmlformats.org/drawingml/2006/main" xmlns:pic="http://schemas.openxmlformats.org/drawingml/2006/picture">
+            <wp:extent cx="5760720" cy="2238843"/>
+            <wp:docPr id="8" name="Picture 8"/>
+            <wp:cNvGraphicFramePr>
+              <a:graphicFrameLocks noChangeAspect="1"/>
+            </wp:cNvGraphicFramePr>
+            <a:graphic>
+              <a:graphicData uri="http://schemas.openxmlformats.org/drawingml/2006/picture">
+                <pic:pic>
+                  <pic:nvPicPr>
+                    <pic:cNvPr id="0" name="image.png"/>
+                    <pic:cNvPicPr/>
+                  </pic:nvPicPr>
+                  <pic:blipFill>
+                    <a:blip r:embed="rId10"/>
+                    <a:stretch>
+                      <a:fillRect/>
+                    </a:stretch>
+                  </pic:blipFill>
+                  <pic:spPr>
+                    <a:xfrm>
+                      <a:off x="0" y="0"/>
+                      <a:ext cx="5760720" cy="2238843"/>
+                    </a:xfrm>
+                    <a:prstGeom prst="rect"/>
+                  </pic:spPr>
+                </pic:pic>
+              </a:graphicData>
+            </a:graphic>
+          </wp:inline>
+        </w:drawing>
+      </w:r>
+    </w:p>
+    <w:p>
+      <w:pPr>
+        <w:jc w:val="center"/>
+      </w:pPr>
+      <w:r>
+        <w:rPr>
+          <w:i/>
+          <w:color w:val="555555"/>
+          <w:sz w:val="18"/>
+        </w:rPr>
+        <w:t>Figure A2 — Virtual Lab: Task 2 embedding comparison — dimensions, pooling, and CPU embedding times (341.12 s / 2034.55 s).</w:t>
+      </w:r>
+    </w:p>
+    <w:p>
+      <w:pPr>
+        <w:jc w:val="center"/>
+      </w:pPr>
+      <w:r>
+        <w:drawing>
+          <wp:inline xmlns:a="http://schemas.openxmlformats.org/drawingml/2006/main" xmlns:pic="http://schemas.openxmlformats.org/drawingml/2006/picture">
+            <wp:extent cx="5760720" cy="2343344"/>
+            <wp:docPr id="9" name="Picture 9"/>
+            <wp:cNvGraphicFramePr>
+              <a:graphicFrameLocks noChangeAspect="1"/>
+            </wp:cNvGraphicFramePr>
+            <a:graphic>
+              <a:graphicData uri="http://schemas.openxmlformats.org/drawingml/2006/picture">
+                <pic:pic>
+                  <pic:nvPicPr>
+                    <pic:cNvPr id="0" name="image.png"/>
+                    <pic:cNvPicPr/>
+                  </pic:nvPicPr>
+                  <pic:blipFill>
+                    <a:blip r:embed="rId11"/>
+                    <a:stretch>
+                      <a:fillRect/>
+                    </a:stretch>
+                  </pic:blipFill>
+                  <pic:spPr>
+                    <a:xfrm>
+                      <a:off x="0" y="0"/>
+                      <a:ext cx="5760720" cy="2343344"/>
+                    </a:xfrm>
+                    <a:prstGeom prst="rect"/>
+                  </pic:spPr>
+                </pic:pic>
+              </a:graphicData>
+            </a:graphic>
+          </wp:inline>
+        </w:drawing>
+      </w:r>
+    </w:p>
+    <w:p>
+      <w:pPr>
+        <w:jc w:val="center"/>
+      </w:pPr>
+      <w:r>
+        <w:rPr>
+          <w:i/>
+          <w:color w:val="555555"/>
+          <w:sz w:val="18"/>
+        </w:rPr>
+        <w:t>Figure A3 — Virtual Lab: Task 3 (DistilBERT) — raw dot-product ranking differs from cosine for 4/5 queries; identities hold 25/25 after L2-normalization.</w:t>
+      </w:r>
+    </w:p>
+    <w:p>
+      <w:pPr>
+        <w:jc w:val="center"/>
+      </w:pPr>
+      <w:r>
+        <w:drawing>
+          <wp:inline xmlns:a="http://schemas.openxmlformats.org/drawingml/2006/main" xmlns:pic="http://schemas.openxmlformats.org/drawingml/2006/picture">
+            <wp:extent cx="5760720" cy="3136737"/>
+            <wp:docPr id="10" name="Picture 10"/>
+            <wp:cNvGraphicFramePr>
+              <a:graphicFrameLocks noChangeAspect="1"/>
+            </wp:cNvGraphicFramePr>
+            <a:graphic>
+              <a:graphicData uri="http://schemas.openxmlformats.org/drawingml/2006/picture">
+                <pic:pic>
+                  <pic:nvPicPr>
+                    <pic:cNvPr id="0" name="image.png"/>
+                    <pic:cNvPicPr/>
+                  </pic:nvPicPr>
+                  <pic:blipFill>
+                    <a:blip r:embed="rId12"/>
+                    <a:stretch>
+                      <a:fillRect/>
+                    </a:stretch>
+                  </pic:blipFill>
+                  <pic:spPr>
+                    <a:xfrm>
+                      <a:off x="0" y="0"/>
+                      <a:ext cx="5760720" cy="3136737"/>
+                    </a:xfrm>
+                    <a:prstGeom prst="rect"/>
+                  </pic:spPr>
+                </pic:pic>
+              </a:graphicData>
+            </a:graphic>
+          </wp:inline>
+        </w:drawing>
+      </w:r>
+    </w:p>
+    <w:p>
+      <w:pPr>
+        <w:jc w:val="center"/>
+      </w:pPr>
+      <w:r>
+        <w:rPr>
+          <w:i/>
+          <w:color w:val="555555"/>
+          <w:sz w:val="18"/>
+        </w:rPr>
+        <w:t>Figure A4 — Virtual Lab: Task 3 (BGE-large) — vectors already unit-length (norms mean=1.0000), ranking unchanged 0/5; identities hold 25/25.</w:t>
+      </w:r>
+    </w:p>
+    <w:p>
+      <w:pPr>
+        <w:jc w:val="center"/>
+      </w:pPr>
+      <w:r>
+        <w:drawing>
+          <wp:inline xmlns:a="http://schemas.openxmlformats.org/drawingml/2006/main" xmlns:pic="http://schemas.openxmlformats.org/drawingml/2006/picture">
+            <wp:extent cx="5760720" cy="3797499"/>
+            <wp:docPr id="11" name="Picture 11"/>
+            <wp:cNvGraphicFramePr>
+              <a:graphicFrameLocks noChangeAspect="1"/>
+            </wp:cNvGraphicFramePr>
+            <a:graphic>
+              <a:graphicData uri="http://schemas.openxmlformats.org/drawingml/2006/picture">
+                <pic:pic>
+                  <pic:nvPicPr>
+                    <pic:cNvPr id="0" name="image.png"/>
+                    <pic:cNvPicPr/>
+                  </pic:nvPicPr>
+                  <pic:blipFill>
+                    <a:blip r:embed="rId13"/>
+                    <a:stretch>
+                      <a:fillRect/>
+                    </a:stretch>
+                  </pic:blipFill>
+                  <pic:spPr>
+                    <a:xfrm>
+                      <a:off x="0" y="0"/>
+                      <a:ext cx="5760720" cy="3797499"/>
+                    </a:xfrm>
+                    <a:prstGeom prst="rect"/>
+                  </pic:spPr>
+                </pic:pic>
+              </a:graphicData>
+            </a:graphic>
+          </wp:inline>
+        </w:drawing>
+      </w:r>
+    </w:p>
+    <w:p>
+      <w:pPr>
+        <w:jc w:val="center"/>
+      </w:pPr>
+      <w:r>
+        <w:rPr>
+          <w:i/>
+          <w:color w:val="555555"/>
+          <w:sz w:val="18"/>
+        </w:rPr>
+        <w:t>Figure A5 — Virtual Lab: Task 8 cross-model exact comparison over 300 queries (Recall@5 0.1078 vs 0.7799).</w:t>
       </w:r>
     </w:p>
     <w:sectPr>

</xml_diff>